<commit_message>
Update 1. Theory of Change-Breaking the cycle.docx
</commit_message>
<xml_diff>
--- a/1. Theory of Change-Breaking the cycle.docx
+++ b/1. Theory of Change-Breaking the cycle.docx
@@ -61,10 +61,7 @@
         </w:rPr>
         <w:t xml:space="preserve">Programme design document — working draft </w:t>
       </w:r>
-    </w:p>
-    <w:p>
-      <w:pPr>
-        <w:spacing w:before="120"/>
+      <w:r>
         <w:rPr>
           <w:rFonts w:ascii="Arial" w:eastAsia="Arial" w:hAnsi="Arial" w:cs="Arial"/>
           <w:i/>
@@ -74,7 +71,8 @@
           <w:szCs w:val="21"/>
           <w:lang w:val="en-US"/>
         </w:rPr>
-      </w:pPr>
+        <w:t xml:space="preserve">| </w:t>
+      </w:r>
       <w:r>
         <w:rPr>
           <w:rFonts w:ascii="Arial" w:eastAsia="Arial" w:hAnsi="Arial" w:cs="Arial"/>
@@ -85,9 +83,8 @@
           <w:szCs w:val="21"/>
           <w:lang w:val="en-US"/>
         </w:rPr>
-        <w:t xml:space="preserve">Prepared by </w:t>
-      </w:r>
-      <w:proofErr w:type="spellStart"/>
+        <w:t>Link</w:t>
+      </w:r>
       <w:r>
         <w:rPr>
           <w:rFonts w:ascii="Arial" w:eastAsia="Arial" w:hAnsi="Arial" w:cs="Arial"/>
@@ -98,9 +95,30 @@
           <w:szCs w:val="21"/>
           <w:lang w:val="en-US"/>
         </w:rPr>
-        <w:t>Sungeun</w:t>
-      </w:r>
-      <w:proofErr w:type="spellEnd"/>
+        <w:t xml:space="preserve">: </w:t>
+      </w:r>
+      <w:hyperlink r:id="rId7" w:history="1">
+        <w:r>
+          <w:rPr>
+            <w:rStyle w:val="Hyperlink"/>
+            <w:rFonts w:ascii="Arial" w:eastAsia="Arial" w:hAnsi="Arial" w:cs="Arial"/>
+            <w:i/>
+            <w:iCs/>
+            <w:sz w:val="21"/>
+            <w:szCs w:val="21"/>
+            <w:lang w:val="en-US"/>
+          </w:rPr>
+          <w:t>sun712k.github.io/portfolio/program-evaluation/</w:t>
+        </w:r>
+      </w:hyperlink>
+    </w:p>
+    <w:p>
+      <w:pPr>
+        <w:spacing w:before="120"/>
+        <w:rPr>
+          <w:lang w:val="en-US"/>
+        </w:rPr>
+      </w:pPr>
       <w:r>
         <w:rPr>
           <w:rFonts w:ascii="Arial" w:eastAsia="Arial" w:hAnsi="Arial" w:cs="Arial"/>
@@ -111,16 +129,9 @@
           <w:szCs w:val="21"/>
           <w:lang w:val="en-US"/>
         </w:rPr>
-        <w:t xml:space="preserve"> Kim</w:t>
-      </w:r>
-    </w:p>
-    <w:p>
-      <w:pPr>
-        <w:spacing w:before="120"/>
-        <w:rPr>
-          <w:lang w:val="en-US"/>
-        </w:rPr>
-      </w:pPr>
+        <w:t xml:space="preserve">Prepared by </w:t>
+      </w:r>
+      <w:proofErr w:type="spellStart"/>
       <w:r>
         <w:rPr>
           <w:rFonts w:ascii="Arial" w:eastAsia="Arial" w:hAnsi="Arial" w:cs="Arial"/>
@@ -131,7 +142,56 @@
           <w:szCs w:val="21"/>
           <w:lang w:val="en-US"/>
         </w:rPr>
+        <w:t>Sungeun</w:t>
+      </w:r>
+      <w:proofErr w:type="spellEnd"/>
+      <w:r>
+        <w:rPr>
+          <w:rFonts w:ascii="Arial" w:eastAsia="Arial" w:hAnsi="Arial" w:cs="Arial"/>
+          <w:i/>
+          <w:iCs/>
+          <w:color w:val="555555"/>
+          <w:sz w:val="21"/>
+          <w:szCs w:val="21"/>
+          <w:lang w:val="en-US"/>
+        </w:rPr>
+        <w:t xml:space="preserve"> Kim</w:t>
+      </w:r>
+      <w:r>
+        <w:rPr>
+          <w:rFonts w:ascii="Arial" w:eastAsia="Arial" w:hAnsi="Arial" w:cs="Arial"/>
+          <w:i/>
+          <w:iCs/>
+          <w:color w:val="555555"/>
+          <w:sz w:val="21"/>
+          <w:szCs w:val="21"/>
+          <w:lang w:val="en-US"/>
+        </w:rPr>
+        <w:t xml:space="preserve"> | </w:t>
+      </w:r>
+      <w:r>
+        <w:rPr>
+          <w:rFonts w:ascii="Arial" w:eastAsia="Arial" w:hAnsi="Arial" w:cs="Arial"/>
+          <w:i/>
+          <w:iCs/>
+          <w:color w:val="555555"/>
+          <w:sz w:val="21"/>
+          <w:szCs w:val="21"/>
+          <w:lang w:val="en-US"/>
+        </w:rPr>
         <w:t>May 15, 2026</w:t>
+      </w:r>
+      <w:r>
+        <w:rPr>
+          <w:rFonts w:ascii="Arial" w:eastAsia="Arial" w:hAnsi="Arial" w:cs="Arial"/>
+          <w:i/>
+          <w:iCs/>
+          <w:color w:val="555555"/>
+          <w:sz w:val="21"/>
+          <w:szCs w:val="21"/>
+          <w:lang w:val="en-US"/>
+        </w:rPr>
+        <w:t xml:space="preserve"> </w:t>
       </w:r>
     </w:p>
     <w:p>
@@ -700,7 +760,7 @@
                     <pic:cNvPicPr/>
                   </pic:nvPicPr>
                   <pic:blipFill rotWithShape="1">
-                    <a:blip r:embed="rId7" cstate="print">
+                    <a:blip r:embed="rId8" cstate="print">
                       <a:extLst>
                         <a:ext uri="{28A0092B-C50C-407E-A947-70E740481C1C}">
                           <a14:useLocalDpi xmlns:a14="http://schemas.microsoft.com/office/drawing/2010/main" val="0"/>
@@ -3791,7 +3851,7 @@
         </w:rPr>
         <w:t xml:space="preserve">van Rosmalen-Nooijens, K. A. W. L., Prins, J. B., Vergeer, M., Wong, S. H., &amp; Lagro-Janssen, A. L. (2013). "Young people, adult worries": RCT of an internet-based self-support method "Feel the ViBe" for children, adolescents and young adults exposed to family violence, a study protocol. BMC Public Health, 13, Article 226. </w:t>
       </w:r>
-      <w:hyperlink r:id="rId8" w:history="1">
+      <w:hyperlink r:id="rId9" w:history="1">
         <w:r>
           <w:rPr>
             <w:rFonts w:ascii="Arial" w:eastAsia="Arial" w:hAnsi="Arial" w:cs="Arial"/>
@@ -3848,7 +3908,7 @@
       </w:pPr>
     </w:p>
     <w:sectPr>
-      <w:footerReference w:type="default" r:id="rId9"/>
+      <w:footerReference w:type="default" r:id="rId10"/>
       <w:pgSz w:w="12240" w:h="15840"/>
       <w:pgMar w:top="1260" w:right="1260" w:bottom="1260" w:left="1260" w:header="708" w:footer="708" w:gutter="0"/>
       <w:cols w:space="720"/>

</xml_diff>